<commit_message>
docs(report): add Table of Contents with page numbers to the Word report
</commit_message>
<xml_diff>
--- a/docs/CloudDrive_Technical_Report.docx
+++ b/docs/CloudDrive_Technical_Report.docx
@@ -57,6 +57,323 @@
         <w:t>Author: Shehriyar Ali Rustam</w:t>
         <w:br/>
         <w:t>Repository: github.com/Shehriyar-Ali-Rustam/clouddrive</w:t>
+      </w:r>
+    </w:p>
+    <w:p>
+      <w:r>
+        <w:br w:type="page"/>
+      </w:r>
+    </w:p>
+    <w:p>
+      <w:pPr>
+        <w:spacing w:after="200"/>
+      </w:pPr>
+      <w:r>
+        <w:rPr>
+          <w:b/>
+          <w:color w:val="2563EB"/>
+          <w:sz w:val="32"/>
+        </w:rPr>
+        <w:t>Table of Contents</w:t>
+      </w:r>
+    </w:p>
+    <w:p>
+      <w:pPr>
+        <w:tabs>
+          <w:tab w:pos="9072" w:val="right" w:leader="dot"/>
+        </w:tabs>
+        <w:spacing w:after="80"/>
+      </w:pPr>
+      <w:r>
+        <w:rPr>
+          <w:color w:val="1F2937"/>
+          <w:sz w:val="21"/>
+        </w:rPr>
+        <w:t>1. Introduction</w:t>
+      </w:r>
+      <w:r>
+        <w:rPr>
+          <w:color w:val="1F2937"/>
+          <w:sz w:val="21"/>
+        </w:rPr>
+        <w:tab/>
+        <w:t>3</w:t>
+      </w:r>
+    </w:p>
+    <w:p>
+      <w:pPr>
+        <w:tabs>
+          <w:tab w:pos="9072" w:val="right" w:leader="dot"/>
+        </w:tabs>
+        <w:spacing w:after="80"/>
+      </w:pPr>
+      <w:r>
+        <w:rPr>
+          <w:color w:val="1F2937"/>
+          <w:sz w:val="21"/>
+        </w:rPr>
+        <w:t>2. Key Features</w:t>
+      </w:r>
+      <w:r>
+        <w:rPr>
+          <w:color w:val="1F2937"/>
+          <w:sz w:val="21"/>
+        </w:rPr>
+        <w:tab/>
+        <w:t>3</w:t>
+      </w:r>
+    </w:p>
+    <w:p>
+      <w:pPr>
+        <w:tabs>
+          <w:tab w:pos="9072" w:val="right" w:leader="dot"/>
+        </w:tabs>
+        <w:spacing w:after="80"/>
+      </w:pPr>
+      <w:r>
+        <w:rPr>
+          <w:color w:val="1F2937"/>
+          <w:sz w:val="21"/>
+        </w:rPr>
+        <w:t>3. System Architecture</w:t>
+      </w:r>
+      <w:r>
+        <w:rPr>
+          <w:color w:val="1F2937"/>
+          <w:sz w:val="21"/>
+        </w:rPr>
+        <w:tab/>
+        <w:t>3</w:t>
+      </w:r>
+    </w:p>
+    <w:p>
+      <w:pPr>
+        <w:tabs>
+          <w:tab w:pos="9072" w:val="right" w:leader="dot"/>
+        </w:tabs>
+        <w:spacing w:after="80"/>
+      </w:pPr>
+      <w:r>
+        <w:rPr>
+          <w:color w:val="1F2937"/>
+          <w:sz w:val="21"/>
+        </w:rPr>
+        <w:t>4. The Pre-signed URL Upload Flow</w:t>
+      </w:r>
+      <w:r>
+        <w:rPr>
+          <w:color w:val="1F2937"/>
+          <w:sz w:val="21"/>
+        </w:rPr>
+        <w:tab/>
+        <w:t>4</w:t>
+      </w:r>
+    </w:p>
+    <w:p>
+      <w:pPr>
+        <w:tabs>
+          <w:tab w:pos="9072" w:val="right" w:leader="dot"/>
+        </w:tabs>
+        <w:spacing w:after="80"/>
+      </w:pPr>
+      <w:r>
+        <w:rPr>
+          <w:color w:val="1F2937"/>
+          <w:sz w:val="21"/>
+        </w:rPr>
+        <w:t>5. Data Model</w:t>
+      </w:r>
+      <w:r>
+        <w:rPr>
+          <w:color w:val="1F2937"/>
+          <w:sz w:val="21"/>
+        </w:rPr>
+        <w:tab/>
+        <w:t>4</w:t>
+      </w:r>
+    </w:p>
+    <w:p>
+      <w:pPr>
+        <w:tabs>
+          <w:tab w:pos="9072" w:val="right" w:leader="dot"/>
+        </w:tabs>
+        <w:spacing w:after="80"/>
+      </w:pPr>
+      <w:r>
+        <w:rPr>
+          <w:color w:val="1F2937"/>
+          <w:sz w:val="21"/>
+        </w:rPr>
+        <w:t>6. Technology Stack — Why Each Tool &amp; Its Benefit</w:t>
+      </w:r>
+      <w:r>
+        <w:rPr>
+          <w:color w:val="1F2937"/>
+          <w:sz w:val="21"/>
+        </w:rPr>
+        <w:tab/>
+        <w:t>5</w:t>
+      </w:r>
+    </w:p>
+    <w:p>
+      <w:pPr>
+        <w:tabs>
+          <w:tab w:pos="9072" w:val="right" w:leader="dot"/>
+        </w:tabs>
+        <w:spacing w:after="80"/>
+      </w:pPr>
+      <w:r>
+        <w:rPr>
+          <w:color w:val="1F2937"/>
+          <w:sz w:val="21"/>
+        </w:rPr>
+        <w:t>7. Security Model</w:t>
+      </w:r>
+      <w:r>
+        <w:rPr>
+          <w:color w:val="1F2937"/>
+          <w:sz w:val="21"/>
+        </w:rPr>
+        <w:tab/>
+        <w:t>6</w:t>
+      </w:r>
+    </w:p>
+    <w:p>
+      <w:pPr>
+        <w:tabs>
+          <w:tab w:pos="9072" w:val="right" w:leader="dot"/>
+        </w:tabs>
+        <w:spacing w:after="80"/>
+      </w:pPr>
+      <w:r>
+        <w:rPr>
+          <w:color w:val="1F2937"/>
+          <w:sz w:val="21"/>
+        </w:rPr>
+        <w:t>8. User Interface</w:t>
+      </w:r>
+      <w:r>
+        <w:rPr>
+          <w:color w:val="1F2937"/>
+          <w:sz w:val="21"/>
+        </w:rPr>
+        <w:tab/>
+        <w:t>7</w:t>
+      </w:r>
+    </w:p>
+    <w:p>
+      <w:pPr>
+        <w:tabs>
+          <w:tab w:pos="9072" w:val="right" w:leader="dot"/>
+        </w:tabs>
+        <w:spacing w:after="80"/>
+      </w:pPr>
+      <w:r>
+        <w:rPr>
+          <w:color w:val="1F2937"/>
+          <w:sz w:val="21"/>
+        </w:rPr>
+        <w:t>9. Cloud Deployment</w:t>
+      </w:r>
+      <w:r>
+        <w:rPr>
+          <w:color w:val="1F2937"/>
+          <w:sz w:val="21"/>
+        </w:rPr>
+        <w:tab/>
+        <w:t>9</w:t>
+      </w:r>
+    </w:p>
+    <w:p>
+      <w:pPr>
+        <w:tabs>
+          <w:tab w:pos="9072" w:val="right" w:leader="dot"/>
+        </w:tabs>
+        <w:spacing w:after="80"/>
+      </w:pPr>
+      <w:r>
+        <w:rPr>
+          <w:color w:val="1F2937"/>
+          <w:sz w:val="21"/>
+        </w:rPr>
+        <w:t>10. Testing</w:t>
+      </w:r>
+      <w:r>
+        <w:rPr>
+          <w:color w:val="1F2937"/>
+          <w:sz w:val="21"/>
+        </w:rPr>
+        <w:tab/>
+        <w:t>10</w:t>
+      </w:r>
+    </w:p>
+    <w:p>
+      <w:pPr>
+        <w:tabs>
+          <w:tab w:pos="9072" w:val="right" w:leader="dot"/>
+        </w:tabs>
+        <w:spacing w:after="80"/>
+      </w:pPr>
+      <w:r>
+        <w:rPr>
+          <w:color w:val="1F2937"/>
+          <w:sz w:val="21"/>
+        </w:rPr>
+        <w:t>11. CI/CD Pipeline</w:t>
+      </w:r>
+      <w:r>
+        <w:rPr>
+          <w:color w:val="1F2937"/>
+          <w:sz w:val="21"/>
+        </w:rPr>
+        <w:tab/>
+        <w:t>10</w:t>
+      </w:r>
+    </w:p>
+    <w:p>
+      <w:pPr>
+        <w:tabs>
+          <w:tab w:pos="9072" w:val="right" w:leader="dot"/>
+        </w:tabs>
+        <w:spacing w:after="80"/>
+      </w:pPr>
+      <w:r>
+        <w:rPr>
+          <w:color w:val="1F2937"/>
+          <w:sz w:val="21"/>
+        </w:rPr>
+        <w:t>12. Cost &amp; Free Tier</w:t>
+      </w:r>
+      <w:r>
+        <w:rPr>
+          <w:color w:val="1F2937"/>
+          <w:sz w:val="21"/>
+        </w:rPr>
+        <w:tab/>
+        <w:t>10</w:t>
+      </w:r>
+    </w:p>
+    <w:p>
+      <w:pPr>
+        <w:tabs>
+          <w:tab w:pos="9072" w:val="right" w:leader="dot"/>
+        </w:tabs>
+        <w:spacing w:after="80"/>
+      </w:pPr>
+      <w:r>
+        <w:rPr>
+          <w:color w:val="1F2937"/>
+          <w:sz w:val="21"/>
+        </w:rPr>
+        <w:t>13. Conclusion &amp; Future Work</w:t>
+      </w:r>
+      <w:r>
+        <w:rPr>
+          <w:color w:val="1F2937"/>
+          <w:sz w:val="21"/>
+        </w:rPr>
+        <w:tab/>
+        <w:t>10</w:t>
       </w:r>
     </w:p>
     <w:p>

</xml_diff>

<commit_message>
docs(report): add Docker, S3-storage & CI/CD sections with real evidence screenshots (GitHub Actions, S3 bucket, container)
</commit_message>
<xml_diff>
--- a/docs/CloudDrive_Technical_Report.docx
+++ b/docs/CloudDrive_Technical_Report.docx
@@ -273,7 +273,7 @@
           <w:color w:val="1F2937"/>
           <w:sz w:val="21"/>
         </w:rPr>
-        <w:t>9. Cloud Deployment</w:t>
+        <w:t>9. Containerization with Docker</w:t>
       </w:r>
       <w:r>
         <w:rPr>
@@ -296,7 +296,7 @@
           <w:color w:val="1F2937"/>
           <w:sz w:val="21"/>
         </w:rPr>
-        <w:t>10. Testing</w:t>
+        <w:t>10. Cloud Storage on Amazon S3</w:t>
       </w:r>
       <w:r>
         <w:rPr>
@@ -319,7 +319,7 @@
           <w:color w:val="1F2937"/>
           <w:sz w:val="21"/>
         </w:rPr>
-        <w:t>11. CI/CD Pipeline</w:t>
+        <w:t>11. Cloud Deployment</w:t>
       </w:r>
       <w:r>
         <w:rPr>
@@ -327,7 +327,7 @@
           <w:sz w:val="21"/>
         </w:rPr>
         <w:tab/>
-        <w:t>10</w:t>
+        <w:t>11</w:t>
       </w:r>
     </w:p>
     <w:p>
@@ -342,7 +342,7 @@
           <w:color w:val="1F2937"/>
           <w:sz w:val="21"/>
         </w:rPr>
-        <w:t>12. Cost &amp; Free Tier</w:t>
+        <w:t>12. Testing</w:t>
       </w:r>
       <w:r>
         <w:rPr>
@@ -350,7 +350,7 @@
           <w:sz w:val="21"/>
         </w:rPr>
         <w:tab/>
-        <w:t>10</w:t>
+        <w:t>12</w:t>
       </w:r>
     </w:p>
     <w:p>
@@ -365,7 +365,7 @@
           <w:color w:val="1F2937"/>
           <w:sz w:val="21"/>
         </w:rPr>
-        <w:t>13. Conclusion &amp; Future Work</w:t>
+        <w:t>13. CI/CD Pipeline</w:t>
       </w:r>
       <w:r>
         <w:rPr>
@@ -373,7 +373,53 @@
           <w:sz w:val="21"/>
         </w:rPr>
         <w:tab/>
-        <w:t>10</w:t>
+        <w:t>12</w:t>
+      </w:r>
+    </w:p>
+    <w:p>
+      <w:pPr>
+        <w:tabs>
+          <w:tab w:pos="9072" w:val="right" w:leader="dot"/>
+        </w:tabs>
+        <w:spacing w:after="80"/>
+      </w:pPr>
+      <w:r>
+        <w:rPr>
+          <w:color w:val="1F2937"/>
+          <w:sz w:val="21"/>
+        </w:rPr>
+        <w:t>14. Cost &amp; Free Tier</w:t>
+      </w:r>
+      <w:r>
+        <w:rPr>
+          <w:color w:val="1F2937"/>
+          <w:sz w:val="21"/>
+        </w:rPr>
+        <w:tab/>
+        <w:t>13</w:t>
+      </w:r>
+    </w:p>
+    <w:p>
+      <w:pPr>
+        <w:tabs>
+          <w:tab w:pos="9072" w:val="right" w:leader="dot"/>
+        </w:tabs>
+        <w:spacing w:after="80"/>
+      </w:pPr>
+      <w:r>
+        <w:rPr>
+          <w:color w:val="1F2937"/>
+          <w:sz w:val="21"/>
+        </w:rPr>
+        <w:t>15. Conclusion &amp; Future Work</w:t>
+      </w:r>
+      <w:r>
+        <w:rPr>
+          <w:color w:val="1F2937"/>
+          <w:sz w:val="21"/>
+        </w:rPr>
+        <w:tab/>
+        <w:t>13</w:t>
       </w:r>
     </w:p>
     <w:p>
@@ -3349,7 +3395,7 @@
         <w:rPr>
           <w:color w:val="2563EB"/>
         </w:rPr>
-        <w:t>9. Cloud Deployment</w:t>
+        <w:t>9. Containerization with Docker</w:t>
       </w:r>
     </w:p>
     <w:p>
@@ -3361,7 +3407,299 @@
           <w:color w:val="1F2937"/>
           <w:sz w:val="21"/>
         </w:rPr>
-        <w:t>Files are stored in a real Amazon S3 bucket using pre-signed URLs. The application can be run or deployed three ways, all sharing the same S3 storage:</w:t>
+        <w:t>The application is packaged as a Docker image so it runs identically on any machine and in the cloud. The Dockerfile installs the dependencies, copies the code, and starts the API server:</w:t>
+      </w:r>
+    </w:p>
+    <w:p>
+      <w:pPr>
+        <w:spacing w:after="160" w:before="40"/>
+      </w:pPr>
+      <w:r>
+        <w:rPr>
+          <w:rFonts w:ascii="Consolas" w:hAnsi="Consolas"/>
+          <w:color w:val="0B3066"/>
+          <w:sz w:val="17"/>
+        </w:rPr>
+        <w:t>FROM python:3.12-slim</w:t>
+        <w:br/>
+      </w:r>
+      <w:r>
+        <w:rPr>
+          <w:rFonts w:ascii="Consolas" w:hAnsi="Consolas"/>
+          <w:color w:val="0B3066"/>
+          <w:sz w:val="17"/>
+        </w:rPr>
+        <w:t>WORKDIR /app</w:t>
+        <w:br/>
+      </w:r>
+      <w:r>
+        <w:rPr>
+          <w:rFonts w:ascii="Consolas" w:hAnsi="Consolas"/>
+          <w:color w:val="0B3066"/>
+          <w:sz w:val="17"/>
+        </w:rPr>
+        <w:t>COPY requirements.txt .</w:t>
+        <w:br/>
+      </w:r>
+      <w:r>
+        <w:rPr>
+          <w:rFonts w:ascii="Consolas" w:hAnsi="Consolas"/>
+          <w:color w:val="0B3066"/>
+          <w:sz w:val="17"/>
+        </w:rPr>
+        <w:t>RUN pip install --no-cache-dir -r requirements.txt</w:t>
+        <w:br/>
+      </w:r>
+      <w:r>
+        <w:rPr>
+          <w:rFonts w:ascii="Consolas" w:hAnsi="Consolas"/>
+          <w:color w:val="0B3066"/>
+          <w:sz w:val="17"/>
+        </w:rPr>
+        <w:t>COPY backend ./backend</w:t>
+        <w:br/>
+      </w:r>
+      <w:r>
+        <w:rPr>
+          <w:rFonts w:ascii="Consolas" w:hAnsi="Consolas"/>
+          <w:color w:val="0B3066"/>
+          <w:sz w:val="17"/>
+        </w:rPr>
+        <w:t>COPY frontend ./frontend</w:t>
+        <w:br/>
+      </w:r>
+      <w:r>
+        <w:rPr>
+          <w:rFonts w:ascii="Consolas" w:hAnsi="Consolas"/>
+          <w:color w:val="0B3066"/>
+          <w:sz w:val="17"/>
+        </w:rPr>
+        <w:t>EXPOSE 8000</w:t>
+        <w:br/>
+      </w:r>
+      <w:r>
+        <w:rPr>
+          <w:rFonts w:ascii="Consolas" w:hAnsi="Consolas"/>
+          <w:color w:val="0B3066"/>
+          <w:sz w:val="17"/>
+        </w:rPr>
+        <w:t>CMD ["uvicorn", "backend.main:app", "--host", "0.0.0.0", "--port", "8000"]</w:t>
+      </w:r>
+    </w:p>
+    <w:p>
+      <w:pPr>
+        <w:spacing w:after="120"/>
+      </w:pPr>
+      <w:r>
+        <w:rPr>
+          <w:color w:val="1F2937"/>
+          <w:sz w:val="21"/>
+        </w:rPr>
+        <w:t>The image was built and run as a live container serving the app on real AWS S3:</w:t>
+      </w:r>
+    </w:p>
+    <w:p>
+      <w:pPr>
+        <w:spacing w:after="160" w:before="40"/>
+      </w:pPr>
+      <w:r>
+        <w:rPr>
+          <w:rFonts w:ascii="Consolas" w:hAnsi="Consolas"/>
+          <w:color w:val="0B3066"/>
+          <w:sz w:val="17"/>
+        </w:rPr>
+        <w:t>$ docker build -t clouddrive-api:latest .</w:t>
+        <w:br/>
+      </w:r>
+      <w:r>
+        <w:rPr>
+          <w:rFonts w:ascii="Consolas" w:hAnsi="Consolas"/>
+          <w:color w:val="0B3066"/>
+          <w:sz w:val="17"/>
+        </w:rPr>
+        <w:t>$ docker run -d --name clouddrive -p 8001:8000 \</w:t>
+        <w:br/>
+      </w:r>
+      <w:r>
+        <w:rPr>
+          <w:rFonts w:ascii="Consolas" w:hAnsi="Consolas"/>
+          <w:color w:val="0B3066"/>
+          <w:sz w:val="17"/>
+        </w:rPr>
+        <w:t xml:space="preserve">      -e STORAGE_BACKEND=s3 -e S3_BUCKET=clouddrive-066496974419 \</w:t>
+        <w:br/>
+      </w:r>
+      <w:r>
+        <w:rPr>
+          <w:rFonts w:ascii="Consolas" w:hAnsi="Consolas"/>
+          <w:color w:val="0B3066"/>
+          <w:sz w:val="17"/>
+        </w:rPr>
+        <w:t xml:space="preserve">      -v ~/.aws:/root/.aws:ro clouddrive-api:latest</w:t>
+      </w:r>
+    </w:p>
+    <w:p>
+      <w:pPr>
+        <w:jc w:val="center"/>
+      </w:pPr>
+      <w:r>
+        <w:drawing>
+          <wp:inline xmlns:a="http://schemas.openxmlformats.org/drawingml/2006/main" xmlns:pic="http://schemas.openxmlformats.org/drawingml/2006/picture">
+            <wp:extent cx="5669280" cy="2747865"/>
+            <wp:docPr id="8" name="Picture 8"/>
+            <wp:cNvGraphicFramePr>
+              <a:graphicFrameLocks noChangeAspect="1"/>
+            </wp:cNvGraphicFramePr>
+            <a:graphic>
+              <a:graphicData uri="http://schemas.openxmlformats.org/drawingml/2006/picture">
+                <pic:pic>
+                  <pic:nvPicPr>
+                    <pic:cNvPr id="0" name="docker.png"/>
+                    <pic:cNvPicPr/>
+                  </pic:nvPicPr>
+                  <pic:blipFill>
+                    <a:blip r:embed="rId16"/>
+                    <a:stretch>
+                      <a:fillRect/>
+                    </a:stretch>
+                  </pic:blipFill>
+                  <pic:spPr>
+                    <a:xfrm>
+                      <a:off x="0" y="0"/>
+                      <a:ext cx="5669280" cy="2747865"/>
+                    </a:xfrm>
+                    <a:prstGeom prst="rect"/>
+                  </pic:spPr>
+                </pic:pic>
+              </a:graphicData>
+            </a:graphic>
+          </wp:inline>
+        </w:drawing>
+      </w:r>
+    </w:p>
+    <w:p>
+      <w:pPr>
+        <w:spacing w:after="200"/>
+        <w:jc w:val="center"/>
+      </w:pPr>
+      <w:r>
+        <w:rPr>
+          <w:i/>
+          <w:color w:val="6B7280"/>
+          <w:sz w:val="18"/>
+        </w:rPr>
+        <w:t>Figure 8: Docker image built (395 MB) and the container running, serving the app on S3.</w:t>
+      </w:r>
+    </w:p>
+    <w:p>
+      <w:pPr>
+        <w:spacing w:after="120"/>
+      </w:pPr>
+      <w:r>
+        <w:rPr>
+          <w:color w:val="1F2937"/>
+          <w:sz w:val="21"/>
+        </w:rPr>
+        <w:t>This same image is pushed to Amazon ECR and run on ECS Fargate in production — locally one container runs the app; in the cloud ECS runs several copies behind the load balancer and autoscales them.</w:t>
+      </w:r>
+    </w:p>
+    <w:p>
+      <w:pPr>
+        <w:pStyle w:val="Heading1"/>
+      </w:pPr>
+      <w:r>
+        <w:rPr>
+          <w:color w:val="2563EB"/>
+        </w:rPr>
+        <w:t>10. Cloud Storage on Amazon S3</w:t>
+      </w:r>
+    </w:p>
+    <w:p>
+      <w:pPr>
+        <w:spacing w:after="120"/>
+      </w:pPr>
+      <w:r>
+        <w:rPr>
+          <w:color w:val="1F2937"/>
+          <w:sz w:val="21"/>
+        </w:rPr>
+        <w:t>File bytes are stored in a real Amazon S3 bucket, uploaded directly by the browser via pre-signed URLs. The bucket has versioning enabled and AES-256 server-side encryption, and blocks all public access. The screenshot below verifies the live bucket contents and settings via the AWS CLI:</w:t>
+      </w:r>
+    </w:p>
+    <w:p>
+      <w:pPr>
+        <w:jc w:val="center"/>
+      </w:pPr>
+      <w:r>
+        <w:drawing>
+          <wp:inline xmlns:a="http://schemas.openxmlformats.org/drawingml/2006/main" xmlns:pic="http://schemas.openxmlformats.org/drawingml/2006/picture">
+            <wp:extent cx="5669280" cy="5004007"/>
+            <wp:docPr id="9" name="Picture 9"/>
+            <wp:cNvGraphicFramePr>
+              <a:graphicFrameLocks noChangeAspect="1"/>
+            </wp:cNvGraphicFramePr>
+            <a:graphic>
+              <a:graphicData uri="http://schemas.openxmlformats.org/drawingml/2006/picture">
+                <pic:pic>
+                  <pic:nvPicPr>
+                    <pic:cNvPr id="0" name="s3_bucket.png"/>
+                    <pic:cNvPicPr/>
+                  </pic:nvPicPr>
+                  <pic:blipFill>
+                    <a:blip r:embed="rId17"/>
+                    <a:stretch>
+                      <a:fillRect/>
+                    </a:stretch>
+                  </pic:blipFill>
+                  <pic:spPr>
+                    <a:xfrm>
+                      <a:off x="0" y="0"/>
+                      <a:ext cx="5669280" cy="5004007"/>
+                    </a:xfrm>
+                    <a:prstGeom prst="rect"/>
+                  </pic:spPr>
+                </pic:pic>
+              </a:graphicData>
+            </a:graphic>
+          </wp:inline>
+        </w:drawing>
+      </w:r>
+    </w:p>
+    <w:p>
+      <w:pPr>
+        <w:spacing w:after="200"/>
+        <w:jc w:val="center"/>
+      </w:pPr>
+      <w:r>
+        <w:rPr>
+          <w:i/>
+          <w:color w:val="6B7280"/>
+          <w:sz w:val="18"/>
+        </w:rPr>
+        <w:t>Figure 9: Real objects stored in the S3 bucket, with versioning enabled and AES-256 encryption.</w:t>
+      </w:r>
+    </w:p>
+    <w:p>
+      <w:pPr>
+        <w:pStyle w:val="Heading1"/>
+      </w:pPr>
+      <w:r>
+        <w:rPr>
+          <w:color w:val="2563EB"/>
+        </w:rPr>
+        <w:t>11. Cloud Deployment</w:t>
+      </w:r>
+    </w:p>
+    <w:p>
+      <w:pPr>
+        <w:spacing w:after="120"/>
+      </w:pPr>
+      <w:r>
+        <w:rPr>
+          <w:color w:val="1F2937"/>
+          <w:sz w:val="21"/>
+        </w:rPr>
+        <w:t>The application can be run or deployed three ways, all sharing the same S3 storage:</w:t>
       </w:r>
     </w:p>
     <w:p>
@@ -3372,7 +3710,7 @@
         <w:drawing>
           <wp:inline xmlns:a="http://schemas.openxmlformats.org/drawingml/2006/main" xmlns:pic="http://schemas.openxmlformats.org/drawingml/2006/picture">
             <wp:extent cx="5486400" cy="569047"/>
-            <wp:docPr id="8" name="Picture 8"/>
+            <wp:docPr id="10" name="Picture 10"/>
             <wp:cNvGraphicFramePr>
               <a:graphicFrameLocks noChangeAspect="1"/>
             </wp:cNvGraphicFramePr>
@@ -3384,7 +3722,7 @@
                     <pic:cNvPicPr/>
                   </pic:nvPicPr>
                   <pic:blipFill>
-                    <a:blip r:embed="rId16"/>
+                    <a:blip r:embed="rId18"/>
                     <a:stretch>
                       <a:fillRect/>
                     </a:stretch>
@@ -3414,7 +3752,7 @@
           <w:color w:val="6B7280"/>
           <w:sz w:val="18"/>
         </w:rPr>
-        <w:t>Figure 8: Deployment options (all use Amazon S3 for files).</w:t>
+        <w:t>Figure 10: Deployment options (all use Amazon S3 for files).</w:t>
       </w:r>
     </w:p>
     <w:p>
@@ -3437,7 +3775,7 @@
         <w:rPr>
           <w:color w:val="2563EB"/>
         </w:rPr>
-        <w:t>10. Testing</w:t>
+        <w:t>12. Testing</w:t>
       </w:r>
     </w:p>
     <w:p>
@@ -3665,7 +4003,19 @@
         <w:rPr>
           <w:color w:val="2563EB"/>
         </w:rPr>
-        <w:t>11. CI/CD Pipeline</w:t>
+        <w:t>13. CI/CD Pipeline</w:t>
+      </w:r>
+    </w:p>
+    <w:p>
+      <w:pPr>
+        <w:spacing w:after="120"/>
+      </w:pPr>
+      <w:r>
+        <w:rPr>
+          <w:color w:val="1F2937"/>
+          <w:sz w:val="21"/>
+        </w:rPr>
+        <w:t>Two GitHub Actions workflows automate delivery: CI runs the tests on every push, and Deploy builds the Docker image, pushes it to Amazon ECR, and rolls it out on ECS.</w:t>
       </w:r>
     </w:p>
     <w:p>
@@ -3676,7 +4026,7 @@
         <w:drawing>
           <wp:inline xmlns:a="http://schemas.openxmlformats.org/drawingml/2006/main" xmlns:pic="http://schemas.openxmlformats.org/drawingml/2006/picture">
             <wp:extent cx="5669280" cy="588015"/>
-            <wp:docPr id="9" name="Picture 9"/>
+            <wp:docPr id="11" name="Picture 11"/>
             <wp:cNvGraphicFramePr>
               <a:graphicFrameLocks noChangeAspect="1"/>
             </wp:cNvGraphicFramePr>
@@ -3688,7 +4038,7 @@
                     <pic:cNvPicPr/>
                   </pic:nvPicPr>
                   <pic:blipFill>
-                    <a:blip r:embed="rId17"/>
+                    <a:blip r:embed="rId19"/>
                     <a:stretch>
                       <a:fillRect/>
                     </a:stretch>
@@ -3718,7 +4068,113 @@
           <w:color w:val="6B7280"/>
           <w:sz w:val="18"/>
         </w:rPr>
-        <w:t>Figure 9: Continuous integration &amp; deployment flow.</w:t>
+        <w:t>Figure 11: Continuous integration &amp; deployment flow.</w:t>
+      </w:r>
+    </w:p>
+    <w:p>
+      <w:pPr>
+        <w:jc w:val="center"/>
+      </w:pPr>
+      <w:r>
+        <w:drawing>
+          <wp:inline xmlns:a="http://schemas.openxmlformats.org/drawingml/2006/main" xmlns:pic="http://schemas.openxmlformats.org/drawingml/2006/picture">
+            <wp:extent cx="5669280" cy="4142935"/>
+            <wp:docPr id="12" name="Picture 12"/>
+            <wp:cNvGraphicFramePr>
+              <a:graphicFrameLocks noChangeAspect="1"/>
+            </wp:cNvGraphicFramePr>
+            <a:graphic>
+              <a:graphicData uri="http://schemas.openxmlformats.org/drawingml/2006/picture">
+                <pic:pic>
+                  <pic:nvPicPr>
+                    <pic:cNvPr id="0" name="gh_actions.png"/>
+                    <pic:cNvPicPr/>
+                  </pic:nvPicPr>
+                  <pic:blipFill>
+                    <a:blip r:embed="rId20"/>
+                    <a:stretch>
+                      <a:fillRect/>
+                    </a:stretch>
+                  </pic:blipFill>
+                  <pic:spPr>
+                    <a:xfrm>
+                      <a:off x="0" y="0"/>
+                      <a:ext cx="5669280" cy="4142935"/>
+                    </a:xfrm>
+                    <a:prstGeom prst="rect"/>
+                  </pic:spPr>
+                </pic:pic>
+              </a:graphicData>
+            </a:graphic>
+          </wp:inline>
+        </w:drawing>
+      </w:r>
+    </w:p>
+    <w:p>
+      <w:pPr>
+        <w:spacing w:after="200"/>
+        <w:jc w:val="center"/>
+      </w:pPr>
+      <w:r>
+        <w:rPr>
+          <w:i/>
+          <w:color w:val="6B7280"/>
+          <w:sz w:val="18"/>
+        </w:rPr>
+        <w:t>Figure 12: GitHub Actions — CI and Deploy workflows running green on every push.</w:t>
+      </w:r>
+    </w:p>
+    <w:p>
+      <w:pPr>
+        <w:jc w:val="center"/>
+      </w:pPr>
+      <w:r>
+        <w:drawing>
+          <wp:inline xmlns:a="http://schemas.openxmlformats.org/drawingml/2006/main" xmlns:pic="http://schemas.openxmlformats.org/drawingml/2006/picture">
+            <wp:extent cx="5669280" cy="4142935"/>
+            <wp:docPr id="13" name="Picture 13"/>
+            <wp:cNvGraphicFramePr>
+              <a:graphicFrameLocks noChangeAspect="1"/>
+            </wp:cNvGraphicFramePr>
+            <a:graphic>
+              <a:graphicData uri="http://schemas.openxmlformats.org/drawingml/2006/picture">
+                <pic:pic>
+                  <pic:nvPicPr>
+                    <pic:cNvPr id="0" name="gh_actions_run.png"/>
+                    <pic:cNvPicPr/>
+                  </pic:nvPicPr>
+                  <pic:blipFill>
+                    <a:blip r:embed="rId21"/>
+                    <a:stretch>
+                      <a:fillRect/>
+                    </a:stretch>
+                  </pic:blipFill>
+                  <pic:spPr>
+                    <a:xfrm>
+                      <a:off x="0" y="0"/>
+                      <a:ext cx="5669280" cy="4142935"/>
+                    </a:xfrm>
+                    <a:prstGeom prst="rect"/>
+                  </pic:spPr>
+                </pic:pic>
+              </a:graphicData>
+            </a:graphic>
+          </wp:inline>
+        </w:drawing>
+      </w:r>
+    </w:p>
+    <w:p>
+      <w:pPr>
+        <w:spacing w:after="200"/>
+        <w:jc w:val="center"/>
+      </w:pPr>
+      <w:r>
+        <w:rPr>
+          <w:i/>
+          <w:color w:val="6B7280"/>
+          <w:sz w:val="18"/>
+        </w:rPr>
+        <w:t>Figure 13: A CI run executing the automated test suite.</w:t>
       </w:r>
     </w:p>
     <w:p>
@@ -3729,7 +4185,7 @@
         <w:rPr>
           <w:color w:val="2563EB"/>
         </w:rPr>
-        <w:t>12. Cost &amp; Free Tier</w:t>
+        <w:t>14. Cost &amp; Free Tier</w:t>
       </w:r>
     </w:p>
     <w:tbl>
@@ -3935,7 +4391,7 @@
         <w:rPr>
           <w:color w:val="2563EB"/>
         </w:rPr>
-        <w:t>13. Conclusion &amp; Future Work</w:t>
+        <w:t>15. Conclusion &amp; Future Work</w:t>
       </w:r>
     </w:p>
     <w:p>

</xml_diff>

<commit_message>
docs(report): credit each member — add Team & Responsibilities table + per-section module-owner notes
</commit_message>
<xml_diff>
--- a/docs/CloudDrive_Technical_Report.docx
+++ b/docs/CloudDrive_Technical_Report.docx
@@ -143,7 +143,7 @@
           <w:sz w:val="21"/>
         </w:rPr>
         <w:tab/>
-        <w:t>3</w:t>
+        <w:t>4</w:t>
       </w:r>
     </w:p>
     <w:p>
@@ -189,7 +189,7 @@
           <w:sz w:val="21"/>
         </w:rPr>
         <w:tab/>
-        <w:t>4</w:t>
+        <w:t>5</w:t>
       </w:r>
     </w:p>
     <w:p>
@@ -235,7 +235,7 @@
           <w:sz w:val="21"/>
         </w:rPr>
         <w:tab/>
-        <w:t>6</w:t>
+        <w:t>7</w:t>
       </w:r>
     </w:p>
     <w:p>
@@ -550,6 +550,222 @@
         <w:t>The system covers authentication, file/folder management, quotas, sharing, and a polished web UI. It runs in two interchangeable modes — local (SQLite + disk) for offline development and AWS (S3 + PostgreSQL) for the cloud — selected purely by configuration, with no code changes.</w:t>
       </w:r>
     </w:p>
+    <w:p>
+      <w:pPr>
+        <w:pStyle w:val="Heading2"/>
+      </w:pPr>
+      <w:r>
+        <w:rPr>
+          <w:color w:val="1F2937"/>
+        </w:rPr>
+        <w:t>1.4 Team &amp; Responsibilities</w:t>
+      </w:r>
+    </w:p>
+    <w:p>
+      <w:pPr>
+        <w:spacing w:after="120"/>
+      </w:pPr>
+      <w:r>
+        <w:rPr>
+          <w:color w:val="1F2937"/>
+          <w:sz w:val="21"/>
+        </w:rPr>
+        <w:t>The project was built by three members. Each owns one feature module and a slice of the cloud/DevOps work; their names are also noted at the start of the relevant sections below.</w:t>
+      </w:r>
+    </w:p>
+    <w:tbl>
+      <w:tblPr>
+        <w:tblStyle w:val="MediumShading1-Accent1"/>
+        <w:tblW w:type="auto" w:w="0"/>
+        <w:jc w:val="center"/>
+        <w:tblLayout w:type="fixed"/>
+        <w:tblLook w:firstColumn="1" w:firstRow="1" w:lastColumn="0" w:lastRow="0" w:noHBand="0" w:noVBand="1" w:val="04A0"/>
+      </w:tblPr>
+      <w:tblGrid>
+        <w:gridCol w:w="2880"/>
+        <w:gridCol w:w="2880"/>
+        <w:gridCol w:w="2880"/>
+      </w:tblGrid>
+      <w:tr>
+        <w:tc>
+          <w:tcPr>
+            <w:tcW w:type="dxa" w:w="2304"/>
+          </w:tcPr>
+          <w:p>
+            <w:r/>
+            <w:r>
+              <w:rPr>
+                <w:b/>
+                <w:sz w:val="19"/>
+              </w:rPr>
+              <w:t>Member</w:t>
+            </w:r>
+          </w:p>
+        </w:tc>
+        <w:tc>
+          <w:tcPr>
+            <w:tcW w:type="dxa" w:w="4464"/>
+          </w:tcPr>
+          <w:p>
+            <w:r/>
+            <w:r>
+              <w:rPr>
+                <w:b/>
+                <w:sz w:val="19"/>
+              </w:rPr>
+              <w:t>Module / task owned</w:t>
+            </w:r>
+          </w:p>
+        </w:tc>
+        <w:tc>
+          <w:tcPr>
+            <w:tcW w:type="dxa" w:w="3744"/>
+          </w:tcPr>
+          <w:p>
+            <w:r/>
+            <w:r>
+              <w:rPr>
+                <w:b/>
+                <w:sz w:val="19"/>
+              </w:rPr>
+              <w:t>Cloud &amp; DevOps contribution</w:t>
+            </w:r>
+          </w:p>
+        </w:tc>
+      </w:tr>
+      <w:tr>
+        <w:tc>
+          <w:tcPr>
+            <w:tcW w:type="dxa" w:w="2304"/>
+          </w:tcPr>
+          <w:p>
+            <w:r/>
+            <w:r>
+              <w:rPr>
+                <w:sz w:val="18"/>
+              </w:rPr>
+              <w:t>Touseef Abbas</w:t>
+            </w:r>
+          </w:p>
+        </w:tc>
+        <w:tc>
+          <w:tcPr>
+            <w:tcW w:type="dxa" w:w="4464"/>
+          </w:tcPr>
+          <w:p>
+            <w:r/>
+            <w:r>
+              <w:rPr>
+                <w:sz w:val="18"/>
+              </w:rPr>
+              <w:t>Authentication &amp; user accounts (JWT, bcrypt, quotas, isolation)</w:t>
+            </w:r>
+          </w:p>
+        </w:tc>
+        <w:tc>
+          <w:tcPr>
+            <w:tcW w:type="dxa" w:w="3744"/>
+          </w:tcPr>
+          <w:p>
+            <w:r/>
+            <w:r>
+              <w:rPr>
+                <w:sz w:val="18"/>
+              </w:rPr>
+              <w:t>Security model, AWS IAM, CI testing</w:t>
+            </w:r>
+          </w:p>
+        </w:tc>
+      </w:tr>
+      <w:tr>
+        <w:tc>
+          <w:tcPr>
+            <w:tcW w:type="dxa" w:w="2304"/>
+          </w:tcPr>
+          <w:p>
+            <w:r/>
+            <w:r>
+              <w:rPr>
+                <w:sz w:val="18"/>
+              </w:rPr>
+              <w:t>Shehriyar Ali Rustam</w:t>
+            </w:r>
+          </w:p>
+        </w:tc>
+        <w:tc>
+          <w:tcPr>
+            <w:tcW w:type="dxa" w:w="4464"/>
+          </w:tcPr>
+          <w:p>
+            <w:r/>
+            <w:r>
+              <w:rPr>
+                <w:sz w:val="18"/>
+              </w:rPr>
+              <w:t>File storage &amp; upload/download (pre-signed URLs, storage layer, folders)</w:t>
+            </w:r>
+          </w:p>
+        </w:tc>
+        <w:tc>
+          <w:tcPr>
+            <w:tcW w:type="dxa" w:w="3744"/>
+          </w:tcPr>
+          <w:p>
+            <w:r/>
+            <w:r>
+              <w:rPr>
+                <w:sz w:val="18"/>
+              </w:rPr>
+              <w:t>Amazon S3, Terraform (IaC)</w:t>
+            </w:r>
+          </w:p>
+        </w:tc>
+      </w:tr>
+      <w:tr>
+        <w:tc>
+          <w:tcPr>
+            <w:tcW w:type="dxa" w:w="2304"/>
+          </w:tcPr>
+          <w:p>
+            <w:r/>
+            <w:r>
+              <w:rPr>
+                <w:sz w:val="18"/>
+              </w:rPr>
+              <w:t>Abdul Ahad</w:t>
+            </w:r>
+          </w:p>
+        </w:tc>
+        <w:tc>
+          <w:tcPr>
+            <w:tcW w:type="dxa" w:w="4464"/>
+          </w:tcPr>
+          <w:p>
+            <w:r/>
+            <w:r>
+              <w:rPr>
+                <w:sz w:val="18"/>
+              </w:rPr>
+              <w:t>Sharing &amp; collaboration (user shares, public links, shared-with-me)</w:t>
+            </w:r>
+          </w:p>
+        </w:tc>
+        <w:tc>
+          <w:tcPr>
+            <w:tcW w:type="dxa" w:w="3744"/>
+          </w:tcPr>
+          <w:p>
+            <w:r/>
+            <w:r>
+              <w:rPr>
+                <w:sz w:val="18"/>
+              </w:rPr>
+              <w:t>Docker, deployment (Render/ECS), networking</w:t>
+            </w:r>
+          </w:p>
+        </w:tc>
+      </w:tr>
+    </w:tbl>
     <w:p>
       <w:pPr>
         <w:pStyle w:val="Heading1"/>
@@ -1281,6 +1497,19 @@
           <w:color w:val="2563EB"/>
         </w:rPr>
         <w:t>4. The Pre-signed URL Upload Flow</w:t>
+      </w:r>
+    </w:p>
+    <w:p>
+      <w:pPr>
+        <w:spacing w:after="120"/>
+      </w:pPr>
+      <w:r>
+        <w:rPr>
+          <w:i/>
+          <w:color w:val="2563EB"/>
+          <w:sz w:val="19"/>
+        </w:rPr>
+        <w:t>Module owner: Shehriyar Ali Rustam</w:t>
       </w:r>
     </w:p>
     <w:p>
@@ -2844,6 +3073,19 @@
         <w:t>7. Security Model</w:t>
       </w:r>
     </w:p>
+    <w:p>
+      <w:pPr>
+        <w:spacing w:after="120"/>
+      </w:pPr>
+      <w:r>
+        <w:rPr>
+          <w:i/>
+          <w:color w:val="2563EB"/>
+          <w:sz w:val="19"/>
+        </w:rPr>
+        <w:t>Module owner: Touseef Abbas</w:t>
+      </w:r>
+    </w:p>
     <w:tbl>
       <w:tblPr>
         <w:tblStyle w:val="MediumShading1-Accent1"/>
@@ -3404,6 +3646,19 @@
       </w:pPr>
       <w:r>
         <w:rPr>
+          <w:i/>
+          <w:color w:val="2563EB"/>
+          <w:sz w:val="19"/>
+        </w:rPr>
+        <w:t>Module owner: Abdul Ahad</w:t>
+      </w:r>
+    </w:p>
+    <w:p>
+      <w:pPr>
+        <w:spacing w:after="120"/>
+      </w:pPr>
+      <w:r>
+        <w:rPr>
           <w:color w:val="1F2937"/>
           <w:sz w:val="21"/>
         </w:rPr>
@@ -3620,6 +3875,19 @@
       </w:pPr>
       <w:r>
         <w:rPr>
+          <w:i/>
+          <w:color w:val="2563EB"/>
+          <w:sz w:val="19"/>
+        </w:rPr>
+        <w:t>Module owner: Shehriyar Ali Rustam</w:t>
+      </w:r>
+    </w:p>
+    <w:p>
+      <w:pPr>
+        <w:spacing w:after="120"/>
+      </w:pPr>
+      <w:r>
+        <w:rPr>
           <w:color w:val="1F2937"/>
           <w:sz w:val="21"/>
         </w:rPr>
@@ -3688,6 +3956,19 @@
           <w:color w:val="2563EB"/>
         </w:rPr>
         <w:t>11. Cloud Deployment</w:t>
+      </w:r>
+    </w:p>
+    <w:p>
+      <w:pPr>
+        <w:spacing w:after="120"/>
+      </w:pPr>
+      <w:r>
+        <w:rPr>
+          <w:i/>
+          <w:color w:val="2563EB"/>
+          <w:sz w:val="19"/>
+        </w:rPr>
+        <w:t>Module owner: Abdul Ahad</w:t>
       </w:r>
     </w:p>
     <w:p>
@@ -4004,6 +4285,19 @@
           <w:color w:val="2563EB"/>
         </w:rPr>
         <w:t>13. CI/CD Pipeline</w:t>
+      </w:r>
+    </w:p>
+    <w:p>
+      <w:pPr>
+        <w:spacing w:after="120"/>
+      </w:pPr>
+      <w:r>
+        <w:rPr>
+          <w:i/>
+          <w:color w:val="2563EB"/>
+          <w:sz w:val="19"/>
+        </w:rPr>
+        <w:t>Module owner: Touseef Abbas</w:t>
       </w:r>
     </w:p>
     <w:p>

</xml_diff>